<commit_message>
RFP v3: report scheduling confirmed available, QBO items in scope, Viking 1 = Aug 1
</commit_message>
<xml_diff>
--- a/rfp-response-fusion-digital.docx
+++ b/rfp-response-fusion-digital.docx
@@ -493,23 +493,23 @@
           <w:tcPr/>
           <w:p>
             <w:r>
-              <w:t xml:space="preserve">To be confirmed</w:t>
-            </w:r>
-          </w:p>
-        </w:tc>
-        <w:tc>
-          <w:tcPr/>
-          <w:p>
-            <w:r>
-              <w:t xml:space="preserve">Dashboards self-service; scheduled delivery not confirmed</w:t>
-            </w:r>
-          </w:p>
-        </w:tc>
-        <w:tc>
-          <w:tcPr/>
-          <w:p>
-            <w:r>
-              <w:t xml:space="preserve">Analytics Hub is self-service today. Scheduled push/email delivery should be confirmed with your account team.</w:t>
+              <w:t xml:space="preserve">Available today</w:t>
+            </w:r>
+          </w:p>
+        </w:tc>
+        <w:tc>
+          <w:tcPr/>
+          <w:p>
+            <w:r>
+              <w:t xml:space="preserve">Native via reporting tools</w:t>
+            </w:r>
+          </w:p>
+        </w:tc>
+        <w:tc>
+          <w:tcPr/>
+          <w:p>
+            <w:r>
+              <w:t xml:space="preserve">Report scheduling is available today through the Rev.io PSA reporting tools. Analytics Hub also supports self-service dashboards and SQL Lab.</w:t>
             </w:r>
           </w:p>
         </w:tc>
@@ -918,7 +918,7 @@
           <w:tcPr/>
           <w:p>
             <w:r>
-              <w:t xml:space="preserve">Not confirmed in current scope</w:t>
+              <w:t xml:space="preserve">On roadmap — in scope</w:t>
             </w:r>
           </w:p>
         </w:tc>
@@ -944,7 +944,7 @@
           <w:tcPr/>
           <w:p>
             <w:r>
-              <w:t xml:space="preserve">Not confirmed in current scope</w:t>
+              <w:t xml:space="preserve">On roadmap — in scope</w:t>
             </w:r>
           </w:p>
         </w:tc>
@@ -970,7 +970,7 @@
           <w:tcPr/>
           <w:p>
             <w:r>
-              <w:t xml:space="preserve">Confirmed in QuickBooks Desktop integration; QBO scope to be confirmed</w:t>
+              <w:t xml:space="preserve">On roadmap — in scope</w:t>
             </w:r>
           </w:p>
         </w:tc>
@@ -996,7 +996,7 @@
           <w:tcPr/>
           <w:p>
             <w:r>
-              <w:t xml:space="preserve">Not confirmed in current scope</w:t>
+              <w:t xml:space="preserve">On roadmap — in scope</w:t>
             </w:r>
           </w:p>
         </w:tc>
@@ -1022,7 +1022,7 @@
           <w:tcPr/>
           <w:p>
             <w:r>
-              <w:t xml:space="preserve">Not confirmed in current scope</w:t>
+              <w:t xml:space="preserve">On roadmap — in scope</w:t>
             </w:r>
           </w:p>
         </w:tc>
@@ -2177,7 +2177,7 @@
     <w:p>
       <w:pPr/>
       <w:r>
-        <w:t xml:space="preserve">Current State: A dedicated RMA module is confirmed on the product roadmap. The RMA feature is listed in the Viking 1 release with PR/FAQ specification complete, described as: "Track product returns, replacements/exchanges, and repairs." It is not yet in active development.</w:t>
+        <w:t xml:space="preserve">Current State: A dedicated RMA module is confirmed on the product roadmap, targeted for the Viking 1 release on August 1, 2026. The PR/FAQ specification is complete. The module will cover tracking product returns, replacements/exchanges, and repairs.</w:t>
       </w:r>
     </w:p>
     <w:p/>
@@ -2924,7 +2924,7 @@
           <w:tcPr/>
           <w:p>
             <w:r>
-              <w:t xml:space="preserve">Scheduled dashboard/report delivery — available today or roadmap?</w:t>
+              <w:t xml:space="preserve">RESOLVED: Available today via reporting tools</w:t>
             </w:r>
           </w:p>
         </w:tc>
@@ -3002,7 +3002,7 @@
           <w:tcPr/>
           <w:p>
             <w:r>
-              <w:t xml:space="preserve">Vendor bills, products/items, GL coding, COGS, partial invoicing — in scope or not?</w:t>
+              <w:t xml:space="preserve">RESOLVED: All items confirmed on roadmap and in scope</w:t>
             </w:r>
           </w:p>
         </w:tc>
@@ -3054,7 +3054,7 @@
           <w:tcPr/>
           <w:p>
             <w:r>
-              <w:t xml:space="preserve">Expected Viking 1 release date / timeline</w:t>
+              <w:t xml:space="preserve">RESOLVED: Viking 1 release targeted August 1, 2026</w:t>
             </w:r>
           </w:p>
         </w:tc>

</xml_diff>

<commit_message>
RFP v4: commissions H2 2026, migration ready now, change orders 6mo, mobile parity confirmed
</commit_message>
<xml_diff>
--- a/rfp-response-fusion-digital.docx
+++ b/rfp-response-fusion-digital.docx
@@ -236,7 +236,7 @@
           <w:tcPr/>
           <w:p>
             <w:r>
-              <w:t xml:space="preserve">No committed date at this time; specification is complete and development sequencing is ongoing</w:t>
+              <w:t xml:space="preserve">Targeted H2 2026 (second half of the year). Specification is complete and the feature is in the development queue.</w:t>
             </w:r>
           </w:p>
         </w:tc>
@@ -255,13 +255,13 @@
           <w:b/>
           <w:sz w:val="18"/>
         </w:rPr>
-        <w:t xml:space="preserve">Our Recommendation: </w:t>
+        <w:t xml:space="preserve">Timeline: </w:t>
       </w:r>
       <w:r>
         <w:rPr>
           <w:sz w:val="20"/>
         </w:rPr>
-        <w:t xml:space="preserve">If commission reporting is a hard requirement at go-live, this should be factored into your evaluation timeline. We recommend requesting a specific sprint commitment from the product team before finalizing any agreement.</w:t>
+        <w:t xml:space="preserve">Commission reporting is targeted for H2 2026. If this is a hard requirement at go-live, discuss the specific delivery expectation with your account team during contract discussions.</w:t>
       </w:r>
     </w:p>
     <w:p/>
@@ -561,23 +561,23 @@
           <w:tcPr/>
           <w:p>
             <w:r>
-              <w:t xml:space="preserve">To be confirmed</w:t>
-            </w:r>
-          </w:p>
-        </w:tc>
-        <w:tc>
-          <w:tcPr/>
-          <w:p>
-            <w:r>
-              <w:t xml:space="preserve">Quote versioning available today</w:t>
-            </w:r>
-          </w:p>
-        </w:tc>
-        <w:tc>
-          <w:tcPr/>
-          <w:p>
-            <w:r>
-              <w:t xml:space="preserve">Quote versioning is supported. Formal change order workflow should be confirmed with your account team.</w:t>
+              <w:t xml:space="preserve">In development — targeted within 6 months</w:t>
+            </w:r>
+          </w:p>
+        </w:tc>
+        <w:tc>
+          <w:tcPr/>
+          <w:p>
+            <w:r>
+              <w:t xml:space="preserve">Quote versioning today; formal workflow coming</w:t>
+            </w:r>
+          </w:p>
+        </w:tc>
+        <w:tc>
+          <w:tcPr/>
+          <w:p>
+            <w:r>
+              <w:t xml:space="preserve">A formal change order workflow is on deck for development within the next 6 months. Quote versioning is available in the platform today.</w:t>
             </w:r>
           </w:p>
         </w:tc>
@@ -1063,7 +1063,7 @@
     <w:p>
       <w:pPr/>
       <w:r>
-        <w:t xml:space="preserve">Tigerpaw migration tooling is actively in development. Here is an accurate picture of where the tooling stands:</w:t>
+        <w:t xml:space="preserve">Tigerpaw migration tooling is available now. The migration framework and adapters are ready to support your transition from Tigerpaw to Rev.io PSA. Here is an overview of the components in place:</w:t>
       </w:r>
     </w:p>
     <w:p/>
@@ -1136,7 +1136,7 @@
           <w:tcPr/>
           <w:p>
             <w:r>
-              <w:t xml:space="preserve">In Progress — 40% complete</w:t>
+              <w:t xml:space="preserve">Available now</w:t>
             </w:r>
           </w:p>
         </w:tc>
@@ -1162,7 +1162,7 @@
           <w:tcPr/>
           <w:p>
             <w:r>
-              <w:t xml:space="preserve">In Progress — 40% complete</w:t>
+              <w:t xml:space="preserve">Available now</w:t>
             </w:r>
           </w:p>
         </w:tc>
@@ -1188,7 +1188,7 @@
           <w:tcPr/>
           <w:p>
             <w:r>
-              <w:t xml:space="preserve">In Progress — 40% complete</w:t>
+              <w:t xml:space="preserve">Available now</w:t>
             </w:r>
           </w:p>
         </w:tc>
@@ -2950,6 +2950,32 @@
           <w:tcPr/>
           <w:p>
             <w:r>
+              <w:t xml:space="preserve">In development — targeted within 6 months; quote versioning available today</w:t>
+            </w:r>
+          </w:p>
+        </w:tc>
+      </w:tr>
+      <w:tr>
+        <w:tc>
+          <w:tcPr/>
+          <w:p>
+            <w:r>
+              <w:t xml:space="preserve">2</w:t>
+            </w:r>
+          </w:p>
+        </w:tc>
+        <w:tc>
+          <w:tcPr/>
+          <w:p>
+            <w:r>
+              <w:t xml:space="preserve">Change orders</w:t>
+            </w:r>
+          </w:p>
+        </w:tc>
+        <w:tc>
+          <w:tcPr/>
+          <w:p>
+            <w:r>
               <w:t xml:space="preserve">Formal change order workflow — supported today or roadmap item?</w:t>
             </w:r>
           </w:p>
@@ -3028,7 +3054,7 @@
           <w:tcPr/>
           <w:p>
             <w:r>
-              <w:t xml:space="preserve">Expected timeline for tooling to reach production-ready state</w:t>
+              <w:t xml:space="preserve">RESOLVED: Available now</w:t>
             </w:r>
           </w:p>
         </w:tc>
@@ -3072,15 +3098,15 @@
           <w:tcPr/>
           <w:p>
             <w:r>
-              <w:t xml:space="preserve">Mobile app clarification</w:t>
-            </w:r>
-          </w:p>
-        </w:tc>
-        <w:tc>
-          <w:tcPr/>
-          <w:p>
-            <w:r>
-              <w:t xml:space="preserve">Relationship between "PSA Field Service" app and current Rev.io mobile app</w:t>
+              <w:t xml:space="preserve">Mobile app</w:t>
+            </w:r>
+          </w:p>
+        </w:tc>
+        <w:tc>
+          <w:tcPr/>
+          <w:p>
+            <w:r>
+              <w:t xml:space="preserve">RESOLVED: Full feature parity with Tigerpaw app + GPS, geofencing, Revii voice AI</w:t>
             </w:r>
           </w:p>
         </w:tc>

</xml_diff>

<commit_message>
QBO: product catalog available today, GL coding H2 2026
</commit_message>
<xml_diff>
--- a/rfp-response-fusion-digital.docx
+++ b/rfp-response-fusion-digital.docx
@@ -936,6 +936,32 @@
           <w:tcPr/>
           <w:p>
             <w:r>
+              <w:t xml:space="preserve">Rev.io → QuickBooks Online</w:t>
+            </w:r>
+          </w:p>
+        </w:tc>
+        <w:tc>
+          <w:tcPr/>
+          <w:p>
+            <w:r>
+              <w:t xml:space="preserve">Available today</w:t>
+            </w:r>
+          </w:p>
+        </w:tc>
+      </w:tr>
+      <w:tr>
+        <w:tc>
+          <w:tcPr/>
+          <w:p>
+            <w:r>
+              <w:t xml:space="preserve">GL coding</w:t>
+            </w:r>
+          </w:p>
+        </w:tc>
+        <w:tc>
+          <w:tcPr/>
+          <w:p>
+            <w:r>
               <w:t xml:space="preserve">—</w:t>
             </w:r>
           </w:p>
@@ -944,33 +970,7 @@
           <w:tcPr/>
           <w:p>
             <w:r>
-              <w:t xml:space="preserve">On roadmap — in scope</w:t>
-            </w:r>
-          </w:p>
-        </w:tc>
-      </w:tr>
-      <w:tr>
-        <w:tc>
-          <w:tcPr/>
-          <w:p>
-            <w:r>
-              <w:t xml:space="preserve">GL coding</w:t>
-            </w:r>
-          </w:p>
-        </w:tc>
-        <w:tc>
-          <w:tcPr/>
-          <w:p>
-            <w:r>
-              <w:t xml:space="preserve">—</w:t>
-            </w:r>
-          </w:p>
-        </w:tc>
-        <w:tc>
-          <w:tcPr/>
-          <w:p>
-            <w:r>
-              <w:t xml:space="preserve">On roadmap — in scope</w:t>
+              <w:t xml:space="preserve">On roadmap — H2 2026</w:t>
             </w:r>
           </w:p>
         </w:tc>

</xml_diff>